<commit_message>
docs: update guide to match simplified auto_add_node.py (no config-profile step)
</commit_message>
<xml_diff>
--- a/Автодобавление_ноды_Руководство.docx
+++ b/Автодобавление_ноды_Руководство.docx
@@ -212,7 +212,7 @@
         <w:rPr>
           <w:sz w:val="21"/>
         </w:rPr>
-        <w:t>Полностью автоматизирует подключение уже присоединённой к Remnawave ноды. В отличие от пункта 3 («Добавить новую ноду», ручной ввод IP/UUID), этот пункт вообще не требует данных о ноде на входе — он сам находит домен, IP и сетевой интерфейс.</w:t>
+        <w:t>Подключает клиентскую сторону для ноды, у которой config-profile и Reality-ключи уже настроены (вручную или заранее) — сам их не создаёт и не трогает. В отличие от пункта 3 («Добавить новую ноду», ручной ввод IP/UUID), этот пункт вообще не требует данных о ноде на входе — он сам находит IP и сетевой интерфейс, а config-profile и VLESS-инбаунд берёт напрямую из уже существующей привязки ноды в Remnawave.</w:t>
       </w:r>
     </w:p>
     <w:p>
@@ -289,19 +289,7 @@
         <w:rPr>
           <w:sz w:val="21"/>
         </w:rPr>
-        <w:t>Номер ноды из списка уже подключённых к Remnawave (адрес, IP, интерфейс подтягиваются сами)</w:t>
-      </w:r>
-    </w:p>
-    <w:p>
-      <w:pPr>
-        <w:pStyle w:val="ListBullet"/>
-        <w:spacing w:after="60"/>
-      </w:pPr>
-      <w:r>
-        <w:rPr>
-          <w:sz w:val="21"/>
-        </w:rPr>
-        <w:t>Тип ноды: простая (WARP) / мост-вход / мост-выход</w:t>
+        <w:t>Номер ноды из списка уже подключённых и настроенных нод (адрес, IP, интерфейс, config-profile подтягиваются сами)</w:t>
       </w:r>
     </w:p>
     <w:p>
@@ -325,7 +313,7 @@
         <w:rPr>
           <w:sz w:val="21"/>
         </w:rPr>
-        <w:t>Подтверждение перед единственным необратимым шагом — привязкой конфига к ноде</w:t>
+        <w:t>Подтверждение перед созданием хоста и шаблона подписки</w:t>
       </w:r>
     </w:p>
     <w:tbl>
@@ -353,6 +341,14 @@
                 <w:sz w:val="20"/>
               </w:rPr>
               <w:t>Важно</w:t>
+            </w:r>
+          </w:p>
+          <w:p>
+            <w:r>
+              <w:rPr>
+                <w:sz w:val="20"/>
+              </w:rPr>
+              <w:t>• Нода должна уже иметь config-profile, привязанный в Remnawave — скрипт не создаёт новых профилей и не генерирует Reality-ключи, только использует то, что уже настроено.</w:t>
             </w:r>
           </w:p>
           <w:p>

</xml_diff>